<commit_message>
Regenerate NyayaSetu synopsis exports
</commit_message>
<xml_diff>
--- a/docs/NyayaSetu_Synopsis.docx
+++ b/docs/NyayaSetu_Synopsis.docx
@@ -11,7 +11,7 @@
           <w:b/>
           <w:sz w:val="36"/>
         </w:rPr>
-        <w:t>NyayaSetu: AI-Powered Legal Intelligence and FIR Assistance Platform</w:t>
+        <w:t>NyayaSetu: AI-Powered Legal Intelligence and FIR Workflow Platform</w:t>
       </w:r>
     </w:p>
     <w:p>
@@ -19,35 +19,75 @@
         <w:pStyle w:val="Heading1"/>
       </w:pPr>
       <w:r>
-        <w:t>1. Title of the Project</w:t>
+        <w:t>1. Introduction</w:t>
       </w:r>
     </w:p>
     <w:p>
       <w:r>
-        <w:t>NyayaSetu: AI-Powered Legal Intelligence and FIR Assistance Platform</w:t>
-      </w:r>
-    </w:p>
-    <w:p>
-      <w:pPr>
-        <w:pStyle w:val="Heading1"/>
-      </w:pPr>
-      <w:r>
-        <w:t>2. Introduction</w:t>
+        <w:t>NyayaSetu is an AI-powered legal-tech platform built to improve access to justice in India by connecting citizens, police personnel, and lawyers through a unified digital system. The platform combines legal research, complaint drafting, FIR generation, case analysis, lawyer discovery, legal networking, and workflow dashboards inside a single application. Its core goal is to make legal help faster, more transparent, more understandable, and more operationally useful.</w:t>
       </w:r>
     </w:p>
     <w:p>
       <w:r>
-        <w:t>India's legal system is complex, document-heavy, multilingual, and often difficult for ordinary citizens to navigate without expert assistance. People frequently struggle to understand which law applies to a given incident, how to prepare an effective complaint, what evidence should be preserved, and what immediate legal steps are practical before engaging a lawyer. Police personnel also face operational challenges when converting unstructured complaints into structured FIR drafts, identifying potentially relevant legal sections, and maintaining consistent procedural detail across reports.</w:t>
+        <w:t>Unlike generic chat assistants, NyayaSetu is designed as a grounded legal system. It uses legal corpora, structured document indexing, retrieval pipelines, role-aware workflows, approval-based access control, and explainable answers tied to specific statutory material. This makes the platform more suitable for legal assistance, FIR preparation, and professional collaboration than a plain large language model interface.</w:t>
+      </w:r>
+    </w:p>
+    <w:p>
+      <w:pPr>
+        <w:pStyle w:val="Heading1"/>
+      </w:pPr>
+      <w:r>
+        <w:t>2. Problem Statement</w:t>
       </w:r>
     </w:p>
     <w:p>
       <w:r>
-        <w:t>NyayaSetu is designed as a practical legal-tech platform that combines artificial intelligence, retrieval-augmented generation, document understanding, and structured legal workflows to improve early-stage legal assistance. The platform is intended to help citizens understand legal situations, support police officers in drafting FIRs, assist in legal research, analyze documents and contracts, and produce readable legal drafts grounded in retrieved legal materials.</w:t>
+        <w:t>Legal access in India is still fragmented for most users:</w:t>
+      </w:r>
+    </w:p>
+    <w:p>
+      <w:pPr>
+        <w:pStyle w:val="ListBullet"/>
+      </w:pPr>
+      <w:r>
+        <w:t>Citizens often do not know which law applies to their issue or how to write a proper complaint.</w:t>
+      </w:r>
+    </w:p>
+    <w:p>
+      <w:pPr>
+        <w:pStyle w:val="ListBullet"/>
+      </w:pPr>
+      <w:r>
+        <w:t>Police workflows can be slowed by incomplete applications, handwritten submissions, and repetitive FIR drafting effort.</w:t>
+      </w:r>
+    </w:p>
+    <w:p>
+      <w:pPr>
+        <w:pStyle w:val="ListBullet"/>
+      </w:pPr>
+      <w:r>
+        <w:t>Lawyers need better digital channels for discovery, trust-building, knowledge sharing, and client communication.</w:t>
+      </w:r>
+    </w:p>
+    <w:p>
+      <w:pPr>
+        <w:pStyle w:val="ListBullet"/>
+      </w:pPr>
+      <w:r>
+        <w:t>Traditional legal search tools are difficult for non-experts and often fail to explain laws in plain language.</w:t>
+      </w:r>
+    </w:p>
+    <w:p>
+      <w:pPr>
+        <w:pStyle w:val="ListBullet"/>
+      </w:pPr>
+      <w:r>
+        <w:t>Pure LLM systems can produce hallucinations, weak citations, and legally unsafe responses if they are not grounded in reliable sources.</w:t>
       </w:r>
     </w:p>
     <w:p>
       <w:r>
-        <w:t>The project is intentionally built using self-hosted, open-source components. This ensures greater control over data privacy, legal-domain customization, deployment flexibility, and independence from proprietary hosted APIs. NyayaSetu therefore functions not merely as a chatbot, but as a modular legal intelligence platform tailored to Indian legal workflows.</w:t>
+        <w:t>NyayaSetu addresses these gaps by combining hybrid legal retrieval, workflow automation, and role-specific legal assistance.</w:t>
       </w:r>
     </w:p>
     <w:p>
@@ -55,40 +95,208 @@
         <w:pStyle w:val="Heading1"/>
       </w:pPr>
       <w:r>
-        <w:t>3. Problem Statement</w:t>
+        <w:t>3. Objectives</w:t>
       </w:r>
     </w:p>
     <w:p>
       <w:r>
-        <w:t>Access to legal knowledge in India remains uneven. Citizens often do not know whether an issue falls under criminal law, civil law, consumer law, cyber law, or contract law. Even when legal information is publicly available, it is rarely presented in a structured, citizen-friendly format. As a result, people delay action, draft incomplete complaints, fail to preserve critical evidence, or approach the wrong authority.</w:t>
+        <w:t>The major objectives of NyayaSetu are:</w:t>
+      </w:r>
+    </w:p>
+    <w:p>
+      <w:pPr>
+        <w:pStyle w:val="ListBullet"/>
+      </w:pPr>
+      <w:r>
+        <w:t>Provide clear and grounded legal guidance in simple, human-understandable language.</w:t>
+      </w:r>
+    </w:p>
+    <w:p>
+      <w:pPr>
+        <w:pStyle w:val="ListBullet"/>
+      </w:pPr>
+      <w:r>
+        <w:t>Support hybrid legal retrieval using both semantic similarity and structured document navigation.</w:t>
+      </w:r>
+    </w:p>
+    <w:p>
+      <w:pPr>
+        <w:pStyle w:val="ListBullet"/>
+      </w:pPr>
+      <w:r>
+        <w:t>Help citizens draft complaints and applications that can be submitted to police authorities.</w:t>
+      </w:r>
+    </w:p>
+    <w:p>
+      <w:pPr>
+        <w:pStyle w:val="ListBullet"/>
+      </w:pPr>
+      <w:r>
+        <w:t>Help police personnel convert citizen inputs into more complete and structured FIR drafts.</w:t>
+      </w:r>
+    </w:p>
+    <w:p>
+      <w:pPr>
+        <w:pStyle w:val="ListBullet"/>
+      </w:pPr>
+      <w:r>
+        <w:t>Help lawyers review FIRs, analyze legal issues, and connect with users through a professional platform.</w:t>
+      </w:r>
+    </w:p>
+    <w:p>
+      <w:pPr>
+        <w:pStyle w:val="ListBullet"/>
+      </w:pPr>
+      <w:r>
+        <w:t>Create an approval-aware ecosystem where lawyer and police accounts are verified before privileged access is granted.</w:t>
+      </w:r>
+    </w:p>
+    <w:p>
+      <w:pPr>
+        <w:pStyle w:val="ListBullet"/>
+      </w:pPr>
+      <w:r>
+        <w:t>Build a scalable legal AI foundation that can evolve with improved retrieval, better datasets, and stronger fine-tuned models.</w:t>
+      </w:r>
+    </w:p>
+    <w:p>
+      <w:pPr>
+        <w:pStyle w:val="Heading1"/>
+      </w:pPr>
+      <w:r>
+        <w:t>4. Proposed Solution</w:t>
       </w:r>
     </w:p>
     <w:p>
       <w:r>
-        <w:t>At the institutional level, police and legal support teams often receive complaints in fragmented or unstructured forms such as handwritten applications, voice narratives, screenshots, or scanned documents. Converting these materials into a consistent FIR draft or investigative summary takes time and is vulnerable to omission of important details such as date, location, witness information, or evidence references.</w:t>
+        <w:t>NyayaSetu is implemented as a modular legal intelligence platform with a separate frontend application and a FastAPI backend. The system combines:</w:t>
+      </w:r>
+    </w:p>
+    <w:p>
+      <w:pPr>
+        <w:pStyle w:val="ListBullet"/>
+      </w:pPr>
+      <w:r>
+        <w:t>An AI Legal Assistant for legal questions, case support, and practical next steps.</w:t>
+      </w:r>
+    </w:p>
+    <w:p>
+      <w:pPr>
+        <w:pStyle w:val="ListBullet"/>
+      </w:pPr>
+      <w:r>
+        <w:t>A hybrid retrieval engine that uses both vector-based RAG and PageIndex-based structural reasoning.</w:t>
+      </w:r>
+    </w:p>
+    <w:p>
+      <w:pPr>
+        <w:pStyle w:val="ListBullet"/>
+      </w:pPr>
+      <w:r>
+        <w:t>A redesigned FIR studio with separate workflows for citizens, police officers, and lawyers.</w:t>
+      </w:r>
+    </w:p>
+    <w:p>
+      <w:pPr>
+        <w:pStyle w:val="ListBullet"/>
+      </w:pPr>
+      <w:r>
+        <w:t>A lawyer marketplace and social knowledge network.</w:t>
+      </w:r>
+    </w:p>
+    <w:p>
+      <w:pPr>
+        <w:pStyle w:val="ListBullet"/>
+      </w:pPr>
+      <w:r>
+        <w:t>Realtime messaging and notifications for ongoing communication.</w:t>
+      </w:r>
+    </w:p>
+    <w:p>
+      <w:pPr>
+        <w:pStyle w:val="ListBullet"/>
+      </w:pPr>
+      <w:r>
+        <w:t>Role-aware authentication, approval workflows, and admin oversight.</w:t>
       </w:r>
     </w:p>
     <w:p>
       <w:r>
-        <w:t>Legal professionals and researchers also spend substantial effort in searching statutes, reading judgments, extracting legal principles, comparing provisions, and reviewing contract language. The absence of integrated AI tooling for Indian legal materials increases time, cost, and procedural inefficiency.</w:t>
+        <w:t>This architecture allows NyayaSetu to function not only as a chatbot, but as a digital justice operations platform.</w:t>
+      </w:r>
+    </w:p>
+    <w:p>
+      <w:pPr>
+        <w:pStyle w:val="Heading1"/>
+      </w:pPr>
+      <w:r>
+        <w:t>5. Key Features and Modules</w:t>
+      </w:r>
+    </w:p>
+    <w:p>
+      <w:pPr>
+        <w:pStyle w:val="Heading2"/>
+      </w:pPr>
+      <w:r>
+        <w:t>5.1 AI Legal Assistant</w:t>
       </w:r>
     </w:p>
     <w:p>
       <w:r>
-        <w:t>NyayaSetu addresses these gaps by creating a unified platform for legal Q and A, document analysis, FIR generation, research retrieval, evidence support, and legal drafting using open-source AI and grounded legal retrieval.</w:t>
+        <w:t>Users can describe a legal issue in plain language and receive:</w:t>
       </w:r>
     </w:p>
     <w:p>
       <w:pPr>
-        <w:pStyle w:val="Heading1"/>
+        <w:pStyle w:val="ListBullet"/>
       </w:pPr>
       <w:r>
-        <w:t>4. Objectives</w:t>
+        <w:t>possible relevant legal provisions</w:t>
+      </w:r>
+    </w:p>
+    <w:p>
+      <w:pPr>
+        <w:pStyle w:val="ListBullet"/>
+      </w:pPr>
+      <w:r>
+        <w:t>plain-language explanations</w:t>
+      </w:r>
+    </w:p>
+    <w:p>
+      <w:pPr>
+        <w:pStyle w:val="ListBullet"/>
+      </w:pPr>
+      <w:r>
+        <w:t>grounded references to sections or statutes</w:t>
+      </w:r>
+    </w:p>
+    <w:p>
+      <w:pPr>
+        <w:pStyle w:val="ListBullet"/>
+      </w:pPr>
+      <w:r>
+        <w:t>recommended next steps</w:t>
+      </w:r>
+    </w:p>
+    <w:p>
+      <w:pPr>
+        <w:pStyle w:val="ListBullet"/>
+      </w:pPr>
+      <w:r>
+        <w:t>related workflow suggestions such as complaint drafting or lawyer discovery</w:t>
+      </w:r>
+    </w:p>
+    <w:p>
+      <w:pPr>
+        <w:pStyle w:val="Heading2"/>
+      </w:pPr>
+      <w:r>
+        <w:t>5.2 Hybrid Retrieval Engine</w:t>
       </w:r>
     </w:p>
     <w:p>
       <w:r>
-        <w:t>The key objectives of NyayaSetu are:</w:t>
+        <w:t>NyayaSetu uses a dual retrieval strategy:</w:t>
       </w:r>
     </w:p>
     <w:p>
@@ -96,7 +304,7 @@
         <w:pStyle w:val="ListBullet"/>
       </w:pPr>
       <w:r>
-        <w:t>To provide accessible legal question answering for Indian law.</w:t>
+        <w:t>RAG pipeline for semantic similarity over chunked legal text</w:t>
       </w:r>
     </w:p>
     <w:p>
@@ -104,297 +312,218 @@
         <w:pStyle w:val="ListBullet"/>
       </w:pPr>
       <w:r>
-        <w:t>To assist in mapping incidents to likely IPC or BNS sections.</w:t>
-      </w:r>
-    </w:p>
-    <w:p>
-      <w:pPr>
-        <w:pStyle w:val="ListBullet"/>
-      </w:pPr>
-      <w:r>
-        <w:t>To generate structured and editable FIR drafts from multiple input modes.</w:t>
-      </w:r>
-    </w:p>
-    <w:p>
-      <w:pPr>
-        <w:pStyle w:val="ListBullet"/>
-      </w:pPr>
-      <w:r>
-        <w:t>To support legal research through semantic retrieval of statutes and case materials.</w:t>
-      </w:r>
-    </w:p>
-    <w:p>
-      <w:pPr>
-        <w:pStyle w:val="ListBullet"/>
-      </w:pPr>
-      <w:r>
-        <w:t>To generate legal drafts such as notices, complaints, and structured legal documents.</w:t>
-      </w:r>
-    </w:p>
-    <w:p>
-      <w:pPr>
-        <w:pStyle w:val="ListBullet"/>
-      </w:pPr>
-      <w:r>
-        <w:t>To analyze contracts for clauses, risks, and missing protections.</w:t>
-      </w:r>
-    </w:p>
-    <w:p>
-      <w:pPr>
-        <w:pStyle w:val="ListBullet"/>
-      </w:pPr>
-      <w:r>
-        <w:t>To analyze evidence and extract text, entities, and timeline clues.</w:t>
-      </w:r>
-    </w:p>
-    <w:p>
-      <w:pPr>
-        <w:pStyle w:val="ListBullet"/>
-      </w:pPr>
-      <w:r>
-        <w:t>To estimate case strength based on evidence and procedural inputs.</w:t>
-      </w:r>
-    </w:p>
-    <w:p>
-      <w:pPr>
-        <w:pStyle w:val="ListBullet"/>
-      </w:pPr>
-      <w:r>
-        <w:t>To support multilingual legal workflows, especially English and Hindi.</w:t>
-      </w:r>
-    </w:p>
-    <w:p>
-      <w:pPr>
-        <w:pStyle w:val="ListBullet"/>
-      </w:pPr>
-      <w:r>
-        <w:t>To maintain a self-hosted, privacy-preserving, open-source deployment model.</w:t>
-      </w:r>
-    </w:p>
-    <w:p>
-      <w:pPr>
-        <w:pStyle w:val="Heading1"/>
-      </w:pPr>
-      <w:r>
-        <w:t>5. Proposed Solution</w:t>
+        <w:t>PageIndex pipeline for reasoning-oriented traversal of legal document structure such as Act -&gt; Chapter -&gt; Section -&gt; Clause</w:t>
       </w:r>
     </w:p>
     <w:p>
       <w:r>
-        <w:t>NyayaSetu is proposed as a complete AI-driven legal intelligence platform built around retrieval-augmented generation, legal document processing, and workflow-oriented backend services. The solution combines open-source large language models, embedding models, OCR pipelines, speech-to-text pipelines, legal corpus ingestion, and a modular API layer for frontend consumption.</w:t>
+        <w:t>This combination improves explainability and reduces over-reliance on embeddings alone.</w:t>
+      </w:r>
+    </w:p>
+    <w:p>
+      <w:pPr>
+        <w:pStyle w:val="Heading2"/>
+      </w:pPr>
+      <w:r>
+        <w:t>5.3 FIR Studio</w:t>
       </w:r>
     </w:p>
     <w:p>
       <w:r>
-        <w:t>At the center of the system is a RAG pipeline. Legal texts from official sources are cleaned, chunked, embedded, indexed in FAISS, and stored with metadata in DuckDB and JSONL. When a user submits a legal question or document, the system converts the query into an embedding, retrieves the most relevant legal chunks, and uses those retrieved materials to generate a grounded answer or legal draft. This improves factual grounding and reduces hallucinated output.</w:t>
+        <w:t>The FIR system is designed as a role-specific workflow:</w:t>
+      </w:r>
+    </w:p>
+    <w:p>
+      <w:pPr>
+        <w:pStyle w:val="ListBullet"/>
+      </w:pPr>
+      <w:r>
+        <w:t>Citizen mode drafts a complaint application in a form suitable for submission to a police station or officer.</w:t>
+      </w:r>
+    </w:p>
+    <w:p>
+      <w:pPr>
+        <w:pStyle w:val="ListBullet"/>
+      </w:pPr>
+      <w:r>
+        <w:t>Police mode converts the application or provided facts into a more complete FIR draft.</w:t>
+      </w:r>
+    </w:p>
+    <w:p>
+      <w:pPr>
+        <w:pStyle w:val="ListBullet"/>
+      </w:pPr>
+      <w:r>
+        <w:t>Lawyer mode analyzes the FIR, highlights issues, and provides legal review support.</w:t>
       </w:r>
     </w:p>
     <w:p>
       <w:r>
-        <w:t>For FIR generation, NyayaSetu accepts manual entry, uploaded complaint documents, and voice transcripts. OCR and speech recognition extract text, entity extraction structures the complaint, a section classifier suggests likely BNS sections, and the system produces an editable FIR draft with reasoning, completeness checks, and version history support.</w:t>
+        <w:t>The FIR workflow supports manual entry, complaint upload, OCR-assisted extraction, voice input, multilingual drafting, edit logs, comparative section references, and PDF download.</w:t>
+      </w:r>
+    </w:p>
+    <w:p>
+      <w:pPr>
+        <w:pStyle w:val="Heading2"/>
+      </w:pPr>
+      <w:r>
+        <w:t>5.4 Case Analysis and Evidence Support</w:t>
       </w:r>
     </w:p>
     <w:p>
       <w:r>
-        <w:t>The platform uses FastAPI for backend services, React for interactive frontend flows, FAISS for vector retrieval, SQLite for lightweight application state, DuckDB for corpus analytics, and self-hosted inference gateways for future deployment of fine-tuned open-source models.</w:t>
+        <w:t>Users can submit facts or documents for legal analysis. The system can surface:</w:t>
       </w:r>
     </w:p>
     <w:p>
       <w:pPr>
-        <w:pStyle w:val="Heading1"/>
+        <w:pStyle w:val="ListBullet"/>
       </w:pPr>
       <w:r>
-        <w:t>6. Key Features and Modules</w:t>
+        <w:t>likely sections</w:t>
       </w:r>
     </w:p>
     <w:p>
       <w:pPr>
+        <w:pStyle w:val="ListBullet"/>
+      </w:pPr>
+      <w:r>
+        <w:t>relevant statutory context</w:t>
+      </w:r>
+    </w:p>
+    <w:p>
+      <w:pPr>
+        <w:pStyle w:val="ListBullet"/>
+      </w:pPr>
+      <w:r>
+        <w:t>preliminary legal reasoning</w:t>
+      </w:r>
+    </w:p>
+    <w:p>
+      <w:pPr>
+        <w:pStyle w:val="ListBullet"/>
+      </w:pPr>
+      <w:r>
+        <w:t>evidence handling guidance</w:t>
+      </w:r>
+    </w:p>
+    <w:p>
+      <w:pPr>
+        <w:pStyle w:val="ListBullet"/>
+      </w:pPr>
+      <w:r>
+        <w:t>practical recommendations</w:t>
+      </w:r>
+    </w:p>
+    <w:p>
+      <w:pPr>
         <w:pStyle w:val="Heading2"/>
       </w:pPr>
       <w:r>
-        <w:t>6.1 AI Legal Chatbot</w:t>
+        <w:t>5.5 Lawyer Discovery and Network</w:t>
       </w:r>
     </w:p>
     <w:p>
       <w:r>
-        <w:t>The AI Legal Chatbot allows users to ask natural-language legal questions. It retrieves relevant legal context from the vectorized corpus and returns grounded answers with citations, reasoning, and a disclaimer. The chatbot is designed to reject or warn on out-of-scope questions when the query is not sufficiently close to the legal corpus in embedding space.</w:t>
+        <w:t>NyayaSetu includes a verified lawyer ecosystem where users can:</w:t>
       </w:r>
     </w:p>
     <w:p>
       <w:pPr>
+        <w:pStyle w:val="ListBullet"/>
+      </w:pPr>
+      <w:r>
+        <w:t>search lawyers by specialization, city, experience, and rating</w:t>
+      </w:r>
+    </w:p>
+    <w:p>
+      <w:pPr>
+        <w:pStyle w:val="ListBullet"/>
+      </w:pPr>
+      <w:r>
+        <w:t>view lawyer handles and public profiles</w:t>
+      </w:r>
+    </w:p>
+    <w:p>
+      <w:pPr>
+        <w:pStyle w:val="ListBullet"/>
+      </w:pPr>
+      <w:r>
+        <w:t>follow lawyers</w:t>
+      </w:r>
+    </w:p>
+    <w:p>
+      <w:pPr>
+        <w:pStyle w:val="ListBullet"/>
+      </w:pPr>
+      <w:r>
+        <w:t>read legal posts and insights</w:t>
+      </w:r>
+    </w:p>
+    <w:p>
+      <w:pPr>
+        <w:pStyle w:val="ListBullet"/>
+      </w:pPr>
+      <w:r>
+        <w:t>contact lawyers through direct messaging</w:t>
+      </w:r>
+    </w:p>
+    <w:p>
+      <w:pPr>
         <w:pStyle w:val="Heading2"/>
       </w:pPr>
       <w:r>
-        <w:t>6.2 Case Analysis Engine</w:t>
+        <w:t>5.6 Dashboards and Role-Based Operations</w:t>
       </w:r>
     </w:p>
     <w:p>
       <w:r>
-        <w:t>This module analyzes incident narratives and attempts to map them to relevant legal provisions. It returns a structured case summary, applicable laws, legal reasoning, possible punishment context, evidence requirements, and recommended next steps. It is intended as an early-stage guidance layer, not a substitute for judicial determination.</w:t>
+        <w:t>The platform contains dedicated surfaces for:</w:t>
       </w:r>
     </w:p>
     <w:p>
       <w:pPr>
-        <w:pStyle w:val="Heading2"/>
+        <w:pStyle w:val="ListBullet"/>
       </w:pPr>
       <w:r>
-        <w:t>6.3 Legal Research Engine</w:t>
+        <w:t>citizens</w:t>
+      </w:r>
+    </w:p>
+    <w:p>
+      <w:pPr>
+        <w:pStyle w:val="ListBullet"/>
+      </w:pPr>
+      <w:r>
+        <w:t>lawyers</w:t>
+      </w:r>
+    </w:p>
+    <w:p>
+      <w:pPr>
+        <w:pStyle w:val="ListBullet"/>
+      </w:pPr>
+      <w:r>
+        <w:t>police users</w:t>
+      </w:r>
+    </w:p>
+    <w:p>
+      <w:pPr>
+        <w:pStyle w:val="ListBullet"/>
+      </w:pPr>
+      <w:r>
+        <w:t>administrators</w:t>
       </w:r>
     </w:p>
     <w:p>
       <w:r>
-        <w:t>The Legal Research Engine supports semantic search across statutes, legal passages, and case law chunks. Rather than relying on exact keyword matching alone, it uses embeddings to retrieve legally similar content. This helps users locate relevant materials even when their wording does not match the formal legal phrasing in the source text.</w:t>
+        <w:t>Lawyer and police dashboards are visible only after approval. The admin panel allows review of applications, approvals, and operational data needed to manage the ecosystem.</w:t>
       </w:r>
     </w:p>
     <w:p>
       <w:pPr>
-        <w:pStyle w:val="Heading2"/>
+        <w:pStyle w:val="Heading1"/>
       </w:pPr>
       <w:r>
-        <w:t>6.4 Legal Document Drafting</w:t>
-      </w:r>
-    </w:p>
-    <w:p>
-      <w:r>
-        <w:t>NyayaSetu can generate structured drafts such as legal notices, complaints, basic contract skeletons, affidavits, and support letters. Draft generation is intended to provide an editable first version that can be reviewed and finalized by the user or legal counsel.</w:t>
-      </w:r>
-    </w:p>
-    <w:p>
-      <w:pPr>
-        <w:pStyle w:val="Heading2"/>
-      </w:pPr>
-      <w:r>
-        <w:t>6.5 Contract Analysis</w:t>
-      </w:r>
-    </w:p>
-    <w:p>
-      <w:r>
-        <w:t>This module ingests contract text or uploaded contract files and identifies clauses, missing protections, and potential risks. It highlights areas such as unilateral discretion, uncapped indemnity, governing law gaps, dispute resolution issues, and missing termination logic.</w:t>
-      </w:r>
-    </w:p>
-    <w:p>
-      <w:pPr>
-        <w:pStyle w:val="Heading2"/>
-      </w:pPr>
-      <w:r>
-        <w:t>6.6 Evidence Analyzer</w:t>
-      </w:r>
-    </w:p>
-    <w:p>
-      <w:r>
-        <w:t>The Evidence Analyzer processes uploaded or pasted evidence material and extracts text, entities, and timeline indicators. It can be extended to support image understanding, audio transcription, and event extraction for investigative workflows.</w:t>
-      </w:r>
-    </w:p>
-    <w:p>
-      <w:pPr>
-        <w:pStyle w:val="Heading2"/>
-      </w:pPr>
-      <w:r>
-        <w:t>6.7 FIR Generator</w:t>
-      </w:r>
-    </w:p>
-    <w:p>
-      <w:r>
-        <w:t>The FIR Generator is one of the core modules of NyayaSetu. It supports manual FIR entry, complaint upload, and voice FIR filing. The module extracts structured information, predicts relevant BNS sections, generates legal reasoning, recommends jurisdiction, assesses completeness, and produces an editable FIR draft with version history.</w:t>
-      </w:r>
-    </w:p>
-    <w:p>
-      <w:pPr>
-        <w:pStyle w:val="Heading2"/>
-      </w:pPr>
-      <w:r>
-        <w:t>6.8 Voice FIR Filing</w:t>
-      </w:r>
-    </w:p>
-    <w:p>
-      <w:r>
-        <w:t>Users may narrate the complaint instead of typing it. Speech is converted into text using an open-source speech recognition model such as Whisper, cleaned, structured, and pushed into the FIR generation workflow.</w:t>
-      </w:r>
-    </w:p>
-    <w:p>
-      <w:pPr>
-        <w:pStyle w:val="Heading2"/>
-      </w:pPr>
-      <w:r>
-        <w:t>6.9 BNS Section Predictor</w:t>
-      </w:r>
-    </w:p>
-    <w:p>
-      <w:r>
-        <w:t>This module suggests relevant provisions under Bharatiya Nyaya Sanhita based on incident description and corpus proximity. It combines rule-based support, corpus retrieval, and model-ready extension points for future fine-tuned classification.</w:t>
-      </w:r>
-    </w:p>
-    <w:p>
-      <w:pPr>
-        <w:pStyle w:val="Heading2"/>
-      </w:pPr>
-      <w:r>
-        <w:t>6.10 Police Jurisdiction Detection</w:t>
-      </w:r>
-    </w:p>
-    <w:p>
-      <w:r>
-        <w:t>Using incident location and a jurisdiction gazetteer, the system suggests a probable police station. This improves FIR routing and helps users identify the likely jurisdiction for filing.</w:t>
-      </w:r>
-    </w:p>
-    <w:p>
-      <w:pPr>
-        <w:pStyle w:val="Heading2"/>
-      </w:pPr>
-      <w:r>
-        <w:t>6.11 FIR Completeness Checker</w:t>
-      </w:r>
-    </w:p>
-    <w:p>
-      <w:r>
-        <w:t>The FIR Completeness Checker verifies whether key fields such as location, date, accused details, evidence information, and witness references are present. It returns a completeness score and actionable suggestions.</w:t>
-      </w:r>
-    </w:p>
-    <w:p>
-      <w:pPr>
-        <w:pStyle w:val="Heading2"/>
-      </w:pPr>
-      <w:r>
-        <w:t>6.12 Crime Pattern Detection</w:t>
-      </w:r>
-    </w:p>
-    <w:p>
-      <w:r>
-        <w:t>This module aggregates FIR-related data over location and time windows to identify repeat incident clusters or hotspot trends. It can assist police and analysts in identifying repeated crime activity.</w:t>
-      </w:r>
-    </w:p>
-    <w:p>
-      <w:pPr>
-        <w:pStyle w:val="Heading2"/>
-      </w:pPr>
-      <w:r>
-        <w:t>6.13 Case Strength Prediction</w:t>
-      </w:r>
-    </w:p>
-    <w:p>
-      <w:r>
-        <w:t>Case strength is estimated using structured inputs such as number of evidence items, witness count, documentary support, complaint status, recency, and jurisdiction match. The score is not a legal verdict but an operational readiness estimate.</w:t>
-      </w:r>
-    </w:p>
-    <w:p>
-      <w:pPr>
-        <w:pStyle w:val="Heading2"/>
-      </w:pPr>
-      <w:r>
-        <w:t>6.14 Admin and Dataset Management</w:t>
-      </w:r>
-    </w:p>
-    <w:p>
-      <w:r>
-        <w:t>The project includes administrative support for updating datasets, refreshing the legal corpus, retraining models in the future, and monitoring corpus size or ingestion status.</w:t>
-      </w:r>
-    </w:p>
-    <w:p>
-      <w:pPr>
-        <w:pStyle w:val="Heading1"/>
-      </w:pPr>
-      <w:r>
-        <w:t>7. System Architecture</w:t>
+        <w:t>6. System Architecture</w:t>
       </w:r>
     </w:p>
     <w:p>
@@ -404,86 +533,56 @@
     </w:p>
     <w:p>
       <w:r>
-        <w:t>1. User interaction occurs through a web frontend. 2. The frontend sends a query, document, FIR input, or evidence file to the FastAPI backend. 3. The backend preprocesses the request and converts text into embeddings using a multilingual embedding model. 4. The retrieval layer searches the FAISS index for the most relevant legal chunks. 5. Retrieved legal context is formatted and passed into the response generation pipeline. 6. The output is returned as a grounded legal answer, draft, analysis, or FIR response.</w:t>
+        <w:t>1. Frontend client for user interaction, role-aware navigation, and workflow execution. 2. FastAPI backend for APIs, authentication, routing, and orchestration. 3. Service layer for legal reasoning, retrieval, FIR generation, messaging, admin operations, and lawyer workflows. 4. Hybrid retrieval layer composed of:</w:t>
       </w:r>
     </w:p>
     <w:p>
       <w:r>
-        <w:t>In RAG terms, the flow is:</w:t>
+        <w:t>5. Inference layer for grounded answer generation and domain-specific output composition. 6. Persistence layer for users, approvals, conversations, FIR records, lawyer profiles, and analytics.</w:t>
+      </w:r>
+    </w:p>
+    <w:p>
+      <w:pPr>
+        <w:pStyle w:val="ListBullet"/>
+      </w:pPr>
+      <w:r>
+        <w:t>FAISS-based semantic retrieval over embedded legal chunks</w:t>
+      </w:r>
+    </w:p>
+    <w:p>
+      <w:pPr>
+        <w:pStyle w:val="ListBullet"/>
+      </w:pPr>
+      <w:r>
+        <w:t>PageIndex-based structural retrieval over legal hierarchy</w:t>
       </w:r>
     </w:p>
     <w:p>
       <w:r>
-        <w:t>User Query -&gt; Embedding Generation -&gt; Vector Retrieval -&gt; Legal Context Fetch -&gt; LLM Reasoning / Response Assembly -&gt; Structured Output</w:t>
+        <w:t>The system is also designed for operational reliability. Hosted startup was improved by making heavy retrieval components initialize lazily, while application authentication and session data can fall back to local SQLite in constrained hosted environments when remote database connectivity is unstable.</w:t>
+      </w:r>
+    </w:p>
+    <w:p>
+      <w:pPr>
+        <w:pStyle w:val="Heading1"/>
+      </w:pPr>
+      <w:r>
+        <w:t>7. Hybrid Retrieval Workflow</w:t>
       </w:r>
     </w:p>
     <w:p>
       <w:r>
-        <w:t>The architecture includes:</w:t>
+        <w:t>When a user submits a legal query, the system follows a hybrid workflow:</w:t>
       </w:r>
     </w:p>
     <w:p>
-      <w:pPr>
-        <w:pStyle w:val="ListBullet"/>
-      </w:pPr>
       <w:r>
-        <w:t>Frontend Layer: React-based interface for legal chat, drafting, FIR workflows, and previews.</w:t>
+        <w:t>1. Understand the query intent, role context, and possible legal domain. 2. Run semantic retrieval over embedded legal chunks. 3. Traverse the PageIndex to identify logically relevant sections in the legal hierarchy. 4. Fuse and rerank results using relevance, legal coverage, and structural confidence. 5. Build a grounded context package with citations and metadata. 6. Generate an answer that explains the law in plain language while avoiding unsupported assumptions.</w:t>
       </w:r>
     </w:p>
     <w:p>
-      <w:pPr>
-        <w:pStyle w:val="ListBullet"/>
-      </w:pPr>
       <w:r>
-        <w:t>Backend Layer: FastAPI routes for chat, research, FIR, analysis, documents, and admin.</w:t>
-      </w:r>
-    </w:p>
-    <w:p>
-      <w:pPr>
-        <w:pStyle w:val="ListBullet"/>
-      </w:pPr>
-      <w:r>
-        <w:t>Retrieval Layer: FAISS index with metadata-backed retrieval.</w:t>
-      </w:r>
-    </w:p>
-    <w:p>
-      <w:pPr>
-        <w:pStyle w:val="ListBullet"/>
-      </w:pPr>
-      <w:r>
-        <w:t>Application Storage: SQLite for audit logs and FIR-related records.</w:t>
-      </w:r>
-    </w:p>
-    <w:p>
-      <w:pPr>
-        <w:pStyle w:val="ListBullet"/>
-      </w:pPr>
-      <w:r>
-        <w:t>Corpus Analytics Layer: DuckDB for corpus chunk analytics, mappings, and ingestion state.</w:t>
-      </w:r>
-    </w:p>
-    <w:p>
-      <w:pPr>
-        <w:pStyle w:val="ListBullet"/>
-      </w:pPr>
-      <w:r>
-        <w:t>Ingestion Layer: Scripts for fetching official legal documents, cleaning text, chunking, and indexing.</w:t>
-      </w:r>
-    </w:p>
-    <w:p>
-      <w:pPr>
-        <w:pStyle w:val="ListBullet"/>
-      </w:pPr>
-      <w:r>
-        <w:t>Inference Layer: Mock mode, local pipeline mode, or self-hosted inference endpoints such as vLLM or TGI.</w:t>
-      </w:r>
-    </w:p>
-    <w:p>
-      <w:pPr>
-        <w:pStyle w:val="ListBullet"/>
-      </w:pPr>
-      <w:r>
-        <w:t>Training Layer: QLoRA and instruction-tuning scripts for future domain-adapted model refinement.</w:t>
+        <w:t>This workflow is especially useful in law because legal meaning often depends on hierarchy, section boundaries, and closely related provisions rather than only semantic similarity.</w:t>
       </w:r>
     </w:p>
     <w:p>
@@ -515,6 +614,14 @@
         <w:pStyle w:val="ListBullet"/>
       </w:pPr>
       <w:r>
+        <w:t>TypeScript</w:t>
+      </w:r>
+    </w:p>
+    <w:p>
+      <w:pPr>
+        <w:pStyle w:val="ListBullet"/>
+      </w:pPr>
+      <w:r>
         <w:t>Vite</w:t>
       </w:r>
     </w:p>
@@ -523,7 +630,15 @@
         <w:pStyle w:val="ListBullet"/>
       </w:pPr>
       <w:r>
-        <w:t>TypeScript</w:t>
+        <w:t>TailwindCSS</w:t>
+      </w:r>
+    </w:p>
+    <w:p>
+      <w:pPr>
+        <w:pStyle w:val="ListBullet"/>
+      </w:pPr>
+      <w:r>
+        <w:t>shadcn/ui</w:t>
       </w:r>
     </w:p>
     <w:p>
@@ -560,10 +675,106 @@
     </w:p>
     <w:p>
       <w:pPr>
+        <w:pStyle w:val="ListBullet"/>
+      </w:pPr>
+      <w:r>
+        <w:t>Pydantic</w:t>
+      </w:r>
+    </w:p>
+    <w:p>
+      <w:pPr>
         <w:pStyle w:val="Heading2"/>
       </w:pPr>
       <w:r>
-        <w:t>Machine Learning and Training</w:t>
+        <w:t>Retrieval and Search</w:t>
+      </w:r>
+    </w:p>
+    <w:p>
+      <w:pPr>
+        <w:pStyle w:val="ListBullet"/>
+      </w:pPr>
+      <w:r>
+        <w:t>FAISS for vector search</w:t>
+      </w:r>
+    </w:p>
+    <w:p>
+      <w:pPr>
+        <w:pStyle w:val="ListBullet"/>
+      </w:pPr>
+      <w:r>
+        <w:t>sentence-transformer style embeddings</w:t>
+      </w:r>
+    </w:p>
+    <w:p>
+      <w:pPr>
+        <w:pStyle w:val="ListBullet"/>
+      </w:pPr>
+      <w:r>
+        <w:t>structured PageIndex JSON for hierarchy-aware traversal</w:t>
+      </w:r>
+    </w:p>
+    <w:p>
+      <w:pPr>
+        <w:pStyle w:val="ListBullet"/>
+      </w:pPr>
+      <w:r>
+        <w:t>metadata filtering and reranking</w:t>
+      </w:r>
+    </w:p>
+    <w:p>
+      <w:pPr>
+        <w:pStyle w:val="Heading2"/>
+      </w:pPr>
+      <w:r>
+        <w:t>Data and Storage</w:t>
+      </w:r>
+    </w:p>
+    <w:p>
+      <w:pPr>
+        <w:pStyle w:val="ListBullet"/>
+      </w:pPr>
+      <w:r>
+        <w:t>SQLite and libSQL/Turso style support for application state</w:t>
+      </w:r>
+    </w:p>
+    <w:p>
+      <w:pPr>
+        <w:pStyle w:val="ListBullet"/>
+      </w:pPr>
+      <w:r>
+        <w:t>DuckDB for corpus analytics</w:t>
+      </w:r>
+    </w:p>
+    <w:p>
+      <w:pPr>
+        <w:pStyle w:val="ListBullet"/>
+      </w:pPr>
+      <w:r>
+        <w:t>JSON/JSONL based processed legal datasets</w:t>
+      </w:r>
+    </w:p>
+    <w:p>
+      <w:pPr>
+        <w:pStyle w:val="ListBullet"/>
+      </w:pPr>
+      <w:r>
+        <w:t>filesystem-based local indexes and artifacts</w:t>
+      </w:r>
+    </w:p>
+    <w:p>
+      <w:pPr>
+        <w:pStyle w:val="Heading2"/>
+      </w:pPr>
+      <w:r>
+        <w:t>AI and Training</w:t>
+      </w:r>
+    </w:p>
+    <w:p>
+      <w:pPr>
+        <w:pStyle w:val="ListBullet"/>
+      </w:pPr>
+      <w:r>
+        <w:t>Transformers</w:t>
       </w:r>
     </w:p>
     <w:p>
@@ -579,7 +790,7 @@
         <w:pStyle w:val="ListBullet"/>
       </w:pPr>
       <w:r>
-        <w:t>Hugging Face Transformers</w:t>
+        <w:t>PEFT / LoRA / QLoRA</w:t>
       </w:r>
     </w:p>
     <w:p>
@@ -587,23 +798,23 @@
         <w:pStyle w:val="ListBullet"/>
       </w:pPr>
       <w:r>
-        <w:t>PEFT</w:t>
+        <w:t>task-specific fine-tuning experiments for legal assistance and FIR generation</w:t>
       </w:r>
     </w:p>
     <w:p>
       <w:pPr>
-        <w:pStyle w:val="ListBullet"/>
+        <w:pStyle w:val="Heading2"/>
       </w:pPr>
       <w:r>
-        <w:t>LoRA / QLoRA</w:t>
+        <w:t>OCR and Speech Support</w:t>
       </w:r>
     </w:p>
     <w:p>
       <w:pPr>
-        <w:pStyle w:val="Heading2"/>
+        <w:pStyle w:val="ListBullet"/>
       </w:pPr>
       <w:r>
-        <w:t>Embeddings</w:t>
+        <w:t>OCR-based complaint extraction</w:t>
       </w:r>
     </w:p>
     <w:p>
@@ -611,140 +822,20 @@
         <w:pStyle w:val="ListBullet"/>
       </w:pPr>
       <w:r>
-        <w:t>BGE multilingual models</w:t>
+        <w:t>speech-to-text support for voice FIR workflows</w:t>
       </w:r>
     </w:p>
     <w:p>
       <w:pPr>
-        <w:pStyle w:val="ListBullet"/>
+        <w:pStyle w:val="Heading1"/>
       </w:pPr>
       <w:r>
-        <w:t>Sentence Transformers</w:t>
-      </w:r>
-    </w:p>
-    <w:p>
-      <w:pPr>
-        <w:pStyle w:val="Heading2"/>
-      </w:pPr>
-      <w:r>
-        <w:t>Inference and Model Serving</w:t>
-      </w:r>
-    </w:p>
-    <w:p>
-      <w:pPr>
-        <w:pStyle w:val="ListBullet"/>
-      </w:pPr>
-      <w:r>
-        <w:t>vLLM</w:t>
-      </w:r>
-    </w:p>
-    <w:p>
-      <w:pPr>
-        <w:pStyle w:val="ListBullet"/>
-      </w:pPr>
-      <w:r>
-        <w:t>Text Generation Inference</w:t>
-      </w:r>
-    </w:p>
-    <w:p>
-      <w:pPr>
-        <w:pStyle w:val="ListBullet"/>
-      </w:pPr>
-      <w:r>
-        <w:t>Ollama for local development</w:t>
-      </w:r>
-    </w:p>
-    <w:p>
-      <w:pPr>
-        <w:pStyle w:val="Heading2"/>
-      </w:pPr>
-      <w:r>
-        <w:t>OCR and Speech</w:t>
-      </w:r>
-    </w:p>
-    <w:p>
-      <w:pPr>
-        <w:pStyle w:val="ListBullet"/>
-      </w:pPr>
-      <w:r>
-        <w:t>Tesseract OCR</w:t>
-      </w:r>
-    </w:p>
-    <w:p>
-      <w:pPr>
-        <w:pStyle w:val="ListBullet"/>
-      </w:pPr>
-      <w:r>
-        <w:t>Whisper</w:t>
-      </w:r>
-    </w:p>
-    <w:p>
-      <w:pPr>
-        <w:pStyle w:val="Heading2"/>
-      </w:pPr>
-      <w:r>
-        <w:t>Databases and Retrieval</w:t>
-      </w:r>
-    </w:p>
-    <w:p>
-      <w:pPr>
-        <w:pStyle w:val="ListBullet"/>
-      </w:pPr>
-      <w:r>
-        <w:t>SQLite</w:t>
-      </w:r>
-    </w:p>
-    <w:p>
-      <w:pPr>
-        <w:pStyle w:val="ListBullet"/>
-      </w:pPr>
-      <w:r>
-        <w:t>DuckDB</w:t>
-      </w:r>
-    </w:p>
-    <w:p>
-      <w:pPr>
-        <w:pStyle w:val="ListBullet"/>
-      </w:pPr>
-      <w:r>
-        <w:t>FAISS</w:t>
-      </w:r>
-    </w:p>
-    <w:p>
-      <w:pPr>
-        <w:pStyle w:val="Heading2"/>
-      </w:pPr>
-      <w:r>
-        <w:t>File and Data Handling</w:t>
-      </w:r>
-    </w:p>
-    <w:p>
-      <w:pPr>
-        <w:pStyle w:val="ListBullet"/>
-      </w:pPr>
-      <w:r>
-        <w:t>JSONL</w:t>
-      </w:r>
-    </w:p>
-    <w:p>
-      <w:pPr>
-        <w:pStyle w:val="ListBullet"/>
-      </w:pPr>
-      <w:r>
-        <w:t>Local filesystem storage</w:t>
-      </w:r>
-    </w:p>
-    <w:p>
-      <w:pPr>
-        <w:pStyle w:val="Heading1"/>
-      </w:pPr>
-      <w:r>
-        <w:t>9. Dataset Sources</w:t>
+        <w:t>9. Legal Data Sources</w:t>
       </w:r>
     </w:p>
     <w:p>
       <w:r>
-        <w:t>NyayaSetu is designed around official and authoritative legal sources. These include:</w:t>
+        <w:t>NyayaSetu is designed around Indian legal sources such as:</w:t>
       </w:r>
     </w:p>
     <w:p>
@@ -752,7 +843,7 @@
         <w:pStyle w:val="ListBullet"/>
       </w:pPr>
       <w:r>
-        <w:t>Gazette of India publications</w:t>
+        <w:t>Bharatiya Nyaya Sanhita (BNS)</w:t>
       </w:r>
     </w:p>
     <w:p>
@@ -760,7 +851,7 @@
         <w:pStyle w:val="ListBullet"/>
       </w:pPr>
       <w:r>
-        <w:t>India Code</w:t>
+        <w:t>Bharatiya Nagarik Suraksha Sanhita (BNSS)</w:t>
       </w:r>
     </w:p>
     <w:p>
@@ -768,7 +859,7 @@
         <w:pStyle w:val="ListBullet"/>
       </w:pPr>
       <w:r>
-        <w:t>Ministry of Law and Justice releases</w:t>
+        <w:t>Indian Penal Code (IPC) for historical comparison and transition support</w:t>
       </w:r>
     </w:p>
     <w:p>
@@ -776,7 +867,7 @@
         <w:pStyle w:val="ListBullet"/>
       </w:pPr>
       <w:r>
-        <w:t>Bharatiya Nyaya Sanhita</w:t>
+        <w:t>Code of Criminal Procedure (CrPC) for legacy legal references</w:t>
       </w:r>
     </w:p>
     <w:p>
@@ -784,52 +875,12 @@
         <w:pStyle w:val="ListBullet"/>
       </w:pPr>
       <w:r>
-        <w:t>Bharatiya Nagarik Suraksha Sanhita</w:t>
-      </w:r>
-    </w:p>
-    <w:p>
-      <w:pPr>
-        <w:pStyle w:val="ListBullet"/>
-      </w:pPr>
-      <w:r>
-        <w:t>Bharatiya Sakshya Adhiniyam</w:t>
-      </w:r>
-    </w:p>
-    <w:p>
-      <w:pPr>
-        <w:pStyle w:val="ListBullet"/>
-      </w:pPr>
-      <w:r>
-        <w:t>Indian Penal Code historical references</w:t>
-      </w:r>
-    </w:p>
-    <w:p>
-      <w:pPr>
-        <w:pStyle w:val="ListBullet"/>
-      </w:pPr>
-      <w:r>
-        <w:t>Supreme Court of India judgments</w:t>
-      </w:r>
-    </w:p>
-    <w:p>
-      <w:pPr>
-        <w:pStyle w:val="ListBullet"/>
-      </w:pPr>
-      <w:r>
-        <w:t>High Court judgments</w:t>
-      </w:r>
-    </w:p>
-    <w:p>
-      <w:pPr>
-        <w:pStyle w:val="ListBullet"/>
-      </w:pPr>
-      <w:r>
-        <w:t>eCourts and related official legal repositories</w:t>
+        <w:t>selected judgments and related legal materials</w:t>
       </w:r>
     </w:p>
     <w:p>
       <w:r>
-        <w:t>Using official material is essential to maintain legal reliability, traceability, and grounded output.</w:t>
+        <w:t>The dataset pipeline includes ingestion, cleaning, chunking, indexing, and structured mapping to support both retrieval and training.</w:t>
       </w:r>
     </w:p>
     <w:p>
@@ -842,222 +893,17 @@
     </w:p>
     <w:p>
       <w:r>
-        <w:t>The methodology of NyayaSetu can be explained in stages.</w:t>
-      </w:r>
-    </w:p>
-    <w:p>
-      <w:pPr>
-        <w:pStyle w:val="Heading2"/>
-      </w:pPr>
-      <w:r>
-        <w:t>10.1 Data Collection</w:t>
+        <w:t>The platform works through the following stages:</w:t>
       </w:r>
     </w:p>
     <w:p>
       <w:r>
-        <w:t>Official legal documents, statutes, and judgments are collected using structured manifests and ingestion scripts.</w:t>
-      </w:r>
-    </w:p>
-    <w:p>
-      <w:pPr>
-        <w:pStyle w:val="Heading2"/>
-      </w:pPr>
-      <w:r>
-        <w:t>10.2 Cleaning and Preprocessing</w:t>
+        <w:t>1. Collect official or curated legal sources. 2. Clean and normalize the text. 3. Chunk the text for semantic retrieval. 4. Build embeddings and store vector indexes. 5. Build PageIndex hierarchies for structural navigation. 6. Accept user input through chat, upload, voice, or workflow forms. 7. Retrieve and rerank legal context. 8. Generate grounded outputs for legal assistance, FIR drafting, or case analysis. 9. Persist records, edits, messages, approvals, and user-facing workflow data.</w:t>
       </w:r>
     </w:p>
     <w:p>
       <w:r>
-        <w:t>Downloaded content is cleaned to remove noise, normalize whitespace, and prepare usable legal text.</w:t>
-      </w:r>
-    </w:p>
-    <w:p>
-      <w:pPr>
-        <w:pStyle w:val="Heading2"/>
-      </w:pPr>
-      <w:r>
-        <w:t>10.3 Chunking</w:t>
-      </w:r>
-    </w:p>
-    <w:p>
-      <w:r>
-        <w:t>Statutes are chunked by sections and structured boundaries, while judgments are chunked into passage windows suitable for retrieval.</w:t>
-      </w:r>
-    </w:p>
-    <w:p>
-      <w:pPr>
-        <w:pStyle w:val="Heading2"/>
-      </w:pPr>
-      <w:r>
-        <w:t>10.4 Embedding Generation</w:t>
-      </w:r>
-    </w:p>
-    <w:p>
-      <w:r>
-        <w:t>Each chunk is converted into a vector representation using a multilingual embedding model.</w:t>
-      </w:r>
-    </w:p>
-    <w:p>
-      <w:pPr>
-        <w:pStyle w:val="Heading2"/>
-      </w:pPr>
-      <w:r>
-        <w:t>10.5 FAISS Indexing</w:t>
-      </w:r>
-    </w:p>
-    <w:p>
-      <w:r>
-        <w:t>The generated embeddings are indexed in FAISS for efficient similarity search.</w:t>
-      </w:r>
-    </w:p>
-    <w:p>
-      <w:pPr>
-        <w:pStyle w:val="Heading2"/>
-      </w:pPr>
-      <w:r>
-        <w:t>10.6 Query Embedding</w:t>
-      </w:r>
-    </w:p>
-    <w:p>
-      <w:r>
-        <w:t>User questions, incident descriptions, and document excerpts are embedded in the same vector space.</w:t>
-      </w:r>
-    </w:p>
-    <w:p>
-      <w:pPr>
-        <w:pStyle w:val="Heading2"/>
-      </w:pPr>
-      <w:r>
-        <w:t>10.7 Retrieval</w:t>
-      </w:r>
-    </w:p>
-    <w:p>
-      <w:r>
-        <w:t>The system retrieves the top relevant legal chunks from the index.</w:t>
-      </w:r>
-    </w:p>
-    <w:p>
-      <w:pPr>
-        <w:pStyle w:val="Heading2"/>
-      </w:pPr>
-      <w:r>
-        <w:t>10.8 Response Generation</w:t>
-      </w:r>
-    </w:p>
-    <w:p>
-      <w:r>
-        <w:t>Retrieved content is used to produce grounded answers, legal drafts, or FIR analysis.</w:t>
-      </w:r>
-    </w:p>
-    <w:p>
-      <w:pPr>
-        <w:pStyle w:val="Heading2"/>
-      </w:pPr>
-      <w:r>
-        <w:t>10.9 Persistence and Editing</w:t>
-      </w:r>
-    </w:p>
-    <w:p>
-      <w:r>
-        <w:t>Generated FIRs and drafts can be stored, versioned, reopened, and edited.</w:t>
-      </w:r>
-    </w:p>
-    <w:p>
-      <w:pPr>
-        <w:pStyle w:val="Heading2"/>
-      </w:pPr>
-      <w:r>
-        <w:t>10.10 FIR Workflow</w:t>
-      </w:r>
-    </w:p>
-    <w:p>
-      <w:r>
-        <w:t>The FIR workflow follows three paths:</w:t>
-      </w:r>
-    </w:p>
-    <w:p>
-      <w:pPr>
-        <w:pStyle w:val="ListBullet"/>
-      </w:pPr>
-      <w:r>
-        <w:t>Manual FIR: user fills a structured form.</w:t>
-      </w:r>
-    </w:p>
-    <w:p>
-      <w:pPr>
-        <w:pStyle w:val="ListBullet"/>
-      </w:pPr>
-      <w:r>
-        <w:t>Complaint Upload: OCR extracts text from image or PDF complaint applications.</w:t>
-      </w:r>
-    </w:p>
-    <w:p>
-      <w:pPr>
-        <w:pStyle w:val="ListBullet"/>
-      </w:pPr>
-      <w:r>
-        <w:t>Voice FIR: speech is converted to transcript and then structured.</w:t>
-      </w:r>
-    </w:p>
-    <w:p>
-      <w:r>
-        <w:t>After extraction, the system performs:</w:t>
-      </w:r>
-    </w:p>
-    <w:p>
-      <w:pPr>
-        <w:pStyle w:val="ListBullet"/>
-      </w:pPr>
-      <w:r>
-        <w:t>entity extraction</w:t>
-      </w:r>
-    </w:p>
-    <w:p>
-      <w:pPr>
-        <w:pStyle w:val="ListBullet"/>
-      </w:pPr>
-      <w:r>
-        <w:t>legal section suggestion</w:t>
-      </w:r>
-    </w:p>
-    <w:p>
-      <w:pPr>
-        <w:pStyle w:val="ListBullet"/>
-      </w:pPr>
-      <w:r>
-        <w:t>jurisdiction detection</w:t>
-      </w:r>
-    </w:p>
-    <w:p>
-      <w:pPr>
-        <w:pStyle w:val="ListBullet"/>
-      </w:pPr>
-      <w:r>
-        <w:t>completeness evaluation</w:t>
-      </w:r>
-    </w:p>
-    <w:p>
-      <w:pPr>
-        <w:pStyle w:val="ListBullet"/>
-      </w:pPr>
-      <w:r>
-        <w:t>case strength scoring</w:t>
-      </w:r>
-    </w:p>
-    <w:p>
-      <w:pPr>
-        <w:pStyle w:val="ListBullet"/>
-      </w:pPr>
-      <w:r>
-        <w:t>draft generation</w:t>
-      </w:r>
-    </w:p>
-    <w:p>
-      <w:pPr>
-        <w:pStyle w:val="ListBullet"/>
-      </w:pPr>
-      <w:r>
-        <w:t>save and version tracking</w:t>
+        <w:t>This methodology helps balance speed, explainability, and legal usefulness.</w:t>
       </w:r>
     </w:p>
     <w:p>
@@ -1070,51 +916,44 @@
     </w:p>
     <w:p>
       <w:r>
-        <w:t>NyayaSetu follows a hybrid open-source model strategy. The platform may use models such as LLaMA 3, Mistral, Mixtral, Falcon, or Phi-3 for generation tasks; BGE and similar models for embeddings; and Whisper for speech transcription.</w:t>
+        <w:t>NyayaSetu uses a retrieval-first strategy rather than relying entirely on a fine-tuned model. The live system prioritizes grounded responses produced from retrieved legal context. Alongside this, local training pipelines are used to improve:</w:t>
+      </w:r>
+    </w:p>
+    <w:p>
+      <w:pPr>
+        <w:pStyle w:val="ListBullet"/>
+      </w:pPr>
+      <w:r>
+        <w:t>plain-language legal explanation</w:t>
+      </w:r>
+    </w:p>
+    <w:p>
+      <w:pPr>
+        <w:pStyle w:val="ListBullet"/>
+      </w:pPr>
+      <w:r>
+        <w:t>follow-up legal guidance</w:t>
+      </w:r>
+    </w:p>
+    <w:p>
+      <w:pPr>
+        <w:pStyle w:val="ListBullet"/>
+      </w:pPr>
+      <w:r>
+        <w:t>FIR drafting quality</w:t>
+      </w:r>
+    </w:p>
+    <w:p>
+      <w:pPr>
+        <w:pStyle w:val="ListBullet"/>
+      </w:pPr>
+      <w:r>
+        <w:t>multilingual workflow support</w:t>
       </w:r>
     </w:p>
     <w:p>
       <w:r>
-        <w:t>The system supports three complementary approaches:</w:t>
-      </w:r>
-    </w:p>
-    <w:p>
-      <w:pPr>
-        <w:pStyle w:val="ListBullet"/>
-      </w:pPr>
-      <w:r>
-        <w:t>Instruction Fine-Tuning for structured legal response behavior</w:t>
-      </w:r>
-    </w:p>
-    <w:p>
-      <w:pPr>
-        <w:pStyle w:val="ListBullet"/>
-      </w:pPr>
-      <w:r>
-        <w:t>Domain Adaptation on Indian legal material</w:t>
-      </w:r>
-    </w:p>
-    <w:p>
-      <w:pPr>
-        <w:pStyle w:val="ListBullet"/>
-      </w:pPr>
-      <w:r>
-        <w:t>Retrieval-Augmented Generation for grounded output and lower hallucination risk</w:t>
-      </w:r>
-    </w:p>
-    <w:p>
-      <w:r>
-        <w:t>The intended training pipeline includes:</w:t>
-      </w:r>
-    </w:p>
-    <w:p>
-      <w:r>
-        <w:t>Legal Dataset -&gt; Cleaning and Preprocessing -&gt; Instruction Formatting -&gt; LoRA / QLoRA Fine-Tuning -&gt; Evaluation -&gt; Deployment</w:t>
-      </w:r>
-    </w:p>
-    <w:p>
-      <w:r>
-        <w:t>This approach allows the system to remain deployable even before full fine-tuning is complete, because retrieval provides grounded context while fine-tuning improves style, instruction following, and legal-domain response quality.</w:t>
+        <w:t>Experiments have shown that lower loss alone is not enough for legal quality. Therefore, model evaluation is done against benchmark prompts and compared with the grounded backend answer path before any model is promoted to live use.</w:t>
       </w:r>
     </w:p>
     <w:p>
@@ -1127,7 +966,7 @@
     </w:p>
     <w:p>
       <w:r>
-        <w:t>The expected outcomes of NyayaSetu include:</w:t>
+        <w:t>NyayaSetu aims to deliver the following outcomes:</w:t>
       </w:r>
     </w:p>
     <w:p>
@@ -1135,7 +974,7 @@
         <w:pStyle w:val="ListBullet"/>
       </w:pPr>
       <w:r>
-        <w:t>faster access to structured legal guidance</w:t>
+        <w:t>faster and more accessible legal assistance for citizens</w:t>
       </w:r>
     </w:p>
     <w:p>
@@ -1143,7 +982,7 @@
         <w:pStyle w:val="ListBullet"/>
       </w:pPr>
       <w:r>
-        <w:t>better FIR drafting support for police and citizens</w:t>
+        <w:t>better quality complaint and FIR preparation</w:t>
       </w:r>
     </w:p>
     <w:p>
@@ -1151,7 +990,7 @@
         <w:pStyle w:val="ListBullet"/>
       </w:pPr>
       <w:r>
-        <w:t>improved understanding of legal sections and procedure</w:t>
+        <w:t>stronger explainability through grounded legal citations</w:t>
       </w:r>
     </w:p>
     <w:p>
@@ -1159,7 +998,7 @@
         <w:pStyle w:val="ListBullet"/>
       </w:pPr>
       <w:r>
-        <w:t>reduced research effort for legal users</w:t>
+        <w:t>improved operational support for police and lawyers</w:t>
       </w:r>
     </w:p>
     <w:p>
@@ -1167,7 +1006,7 @@
         <w:pStyle w:val="ListBullet"/>
       </w:pPr>
       <w:r>
-        <w:t>improved quality of first-draft legal documents</w:t>
+        <w:t>a verified digital legal network for discovery, communication, and trust</w:t>
       </w:r>
     </w:p>
     <w:p>
@@ -1175,28 +1014,20 @@
         <w:pStyle w:val="ListBullet"/>
       </w:pPr>
       <w:r>
-        <w:t>stronger organization of evidence and incident details</w:t>
+        <w:t>a scalable foundation for future Indian legal AI infrastructure</w:t>
       </w:r>
     </w:p>
     <w:p>
       <w:pPr>
-        <w:pStyle w:val="ListBullet"/>
+        <w:pStyle w:val="Heading1"/>
       </w:pPr>
       <w:r>
-        <w:t>a privacy-conscious self-hosted legal AI platform</w:t>
-      </w:r>
-    </w:p>
-    <w:p>
-      <w:pPr>
-        <w:pStyle w:val="Heading1"/>
-      </w:pPr>
-      <w:r>
-        <w:t>13. Advantages of the System</w:t>
+        <w:t>13. Advantages</w:t>
       </w:r>
     </w:p>
     <w:p>
       <w:r>
-        <w:t>NyayaSetu offers multiple advantages:</w:t>
+        <w:t>The main advantages of NyayaSetu are:</w:t>
       </w:r>
     </w:p>
     <w:p>
@@ -1204,7 +1035,7 @@
         <w:pStyle w:val="ListBullet"/>
       </w:pPr>
       <w:r>
-        <w:t>fully based on open-source and self-hosted architecture</w:t>
+        <w:t>hybrid retrieval improves trustworthiness over plain LLM chat</w:t>
       </w:r>
     </w:p>
     <w:p>
@@ -1212,7 +1043,7 @@
         <w:pStyle w:val="ListBullet"/>
       </w:pPr>
       <w:r>
-        <w:t>better privacy control than third-party hosted AI APIs</w:t>
+        <w:t>role-specific workflows make the platform practically useful, not just informational</w:t>
       </w:r>
     </w:p>
     <w:p>
@@ -1220,7 +1051,7 @@
         <w:pStyle w:val="ListBullet"/>
       </w:pPr>
       <w:r>
-        <w:t>modular system design</w:t>
+        <w:t>FIR generation is separated for citizen, police, and lawyer use cases</w:t>
       </w:r>
     </w:p>
     <w:p>
@@ -1228,7 +1059,7 @@
         <w:pStyle w:val="ListBullet"/>
       </w:pPr>
       <w:r>
-        <w:t>support for retrieval-grounded legal outputs</w:t>
+        <w:t>admin approvals improve verification for sensitive professional roles</w:t>
       </w:r>
     </w:p>
     <w:p>
@@ -1236,7 +1067,7 @@
         <w:pStyle w:val="ListBullet"/>
       </w:pPr>
       <w:r>
-        <w:t>useful for both citizens and institutional users</w:t>
+        <w:t>social and messaging features make the platform a continuing ecosystem rather than a one-time tool</w:t>
       </w:r>
     </w:p>
     <w:p>
@@ -1244,28 +1075,20 @@
         <w:pStyle w:val="ListBullet"/>
       </w:pPr>
       <w:r>
-        <w:t>capable of multilingual extension</w:t>
+        <w:t>modular architecture supports future model, data, and workflow upgrades</w:t>
       </w:r>
     </w:p>
     <w:p>
       <w:pPr>
-        <w:pStyle w:val="ListBullet"/>
+        <w:pStyle w:val="Heading1"/>
       </w:pPr>
       <w:r>
-        <w:t>suitable for future scaling and fine-tuning</w:t>
-      </w:r>
-    </w:p>
-    <w:p>
-      <w:pPr>
-        <w:pStyle w:val="Heading1"/>
-      </w:pPr>
-      <w:r>
-        <w:t>14. Limitations</w:t>
+        <w:t>14. Current Limitations</w:t>
       </w:r>
     </w:p>
     <w:p>
       <w:r>
-        <w:t>Despite its usefulness, NyayaSetu has important limitations:</w:t>
+        <w:t>Although NyayaSetu is functionally broad, some limitations remain:</w:t>
       </w:r>
     </w:p>
     <w:p>
@@ -1273,7 +1096,7 @@
         <w:pStyle w:val="ListBullet"/>
       </w:pPr>
       <w:r>
-        <w:t>it is not a substitute for a licensed advocate or judicial advice</w:t>
+        <w:t>legal data coverage is still expanding, especially across judgments and additional statutes</w:t>
       </w:r>
     </w:p>
     <w:p>
@@ -1281,7 +1104,7 @@
         <w:pStyle w:val="ListBullet"/>
       </w:pPr>
       <w:r>
-        <w:t>legal conclusions still depend on facts, evidence quality, and court interpretation</w:t>
+        <w:t>model fine-tuning has not yet surpassed the strongest grounded backend answer path for all benchmark cases</w:t>
       </w:r>
     </w:p>
     <w:p>
@@ -1289,7 +1112,7 @@
         <w:pStyle w:val="ListBullet"/>
       </w:pPr>
       <w:r>
-        <w:t>OCR and speech-to-text may introduce extraction errors</w:t>
+        <w:t>hosted environments may still need careful tuning for latency, persistence, and heavy OCR or inference tasks</w:t>
       </w:r>
     </w:p>
     <w:p>
@@ -1297,23 +1120,7 @@
         <w:pStyle w:val="ListBullet"/>
       </w:pPr>
       <w:r>
-        <w:t>retrieval quality depends on corpus quality and freshness</w:t>
-      </w:r>
-    </w:p>
-    <w:p>
-      <w:pPr>
-        <w:pStyle w:val="ListBullet"/>
-      </w:pPr>
-      <w:r>
-        <w:t>legal nuance and jurisdiction-specific interpretation may still require human review</w:t>
-      </w:r>
-    </w:p>
-    <w:p>
-      <w:pPr>
-        <w:pStyle w:val="ListBullet"/>
-      </w:pPr>
-      <w:r>
-        <w:t>model outputs can still be imperfect even when grounded</w:t>
+        <w:t>multilingual performance and document understanding can be improved further</w:t>
       </w:r>
     </w:p>
     <w:p>
@@ -1334,7 +1141,7 @@
         <w:pStyle w:val="ListBullet"/>
       </w:pPr>
       <w:r>
-        <w:t>deeper multilingual legal support across Indian languages</w:t>
+        <w:t>expanding statute and judgment coverage</w:t>
       </w:r>
     </w:p>
     <w:p>
@@ -1342,7 +1149,7 @@
         <w:pStyle w:val="ListBullet"/>
       </w:pPr>
       <w:r>
-        <w:t>more advanced legal voice assistant workflows</w:t>
+        <w:t>stronger reranking and citation-aware answer generation</w:t>
       </w:r>
     </w:p>
     <w:p>
@@ -1350,7 +1157,7 @@
         <w:pStyle w:val="ListBullet"/>
       </w:pPr>
       <w:r>
-        <w:t>real-time court and cause-list integration</w:t>
+        <w:t>better multilingual complaint and FIR support</w:t>
       </w:r>
     </w:p>
     <w:p>
@@ -1358,7 +1165,7 @@
         <w:pStyle w:val="ListBullet"/>
       </w:pPr>
       <w:r>
-        <w:t>broader case law analytics</w:t>
+        <w:t>improved fine-tuned legal and FIR specialist models</w:t>
       </w:r>
     </w:p>
     <w:p>
@@ -1366,7 +1173,7 @@
         <w:pStyle w:val="ListBullet"/>
       </w:pPr>
       <w:r>
-        <w:t>mobile application deployment</w:t>
+        <w:t>deeper analytics for crime patterns and operational dashboards</w:t>
       </w:r>
     </w:p>
     <w:p>
@@ -1374,7 +1181,7 @@
         <w:pStyle w:val="ListBullet"/>
       </w:pPr>
       <w:r>
-        <w:t>lawyer and legal aid discovery integration</w:t>
+        <w:t>production-grade persistent deployments across frontend, backend, and legal data services</w:t>
       </w:r>
     </w:p>
     <w:p>
@@ -1382,31 +1189,7 @@
         <w:pStyle w:val="ListBullet"/>
       </w:pPr>
       <w:r>
-        <w:t>advanced legal risk dashboards</w:t>
-      </w:r>
-    </w:p>
-    <w:p>
-      <w:pPr>
-        <w:pStyle w:val="ListBullet"/>
-      </w:pPr>
-      <w:r>
-        <w:t>e-signature and document workflow support</w:t>
-      </w:r>
-    </w:p>
-    <w:p>
-      <w:pPr>
-        <w:pStyle w:val="ListBullet"/>
-      </w:pPr>
-      <w:r>
-        <w:t>richer police jurisdiction maps</w:t>
-      </w:r>
-    </w:p>
-    <w:p>
-      <w:pPr>
-        <w:pStyle w:val="ListBullet"/>
-      </w:pPr>
-      <w:r>
-        <w:t>GPU-backed scalable inference deployment for larger models</w:t>
+        <w:t>possible integration with institutional legal, police, or court workflows</w:t>
       </w:r>
     </w:p>
     <w:p>
@@ -1419,105 +1202,7 @@
     </w:p>
     <w:p>
       <w:r>
-        <w:t>NyayaSetu represents a practical and socially meaningful use of open-source AI in the legal domain. By combining retrieval-augmented generation, legal corpus search, FIR drafting, document analysis, and evidence workflows, it aims to reduce barriers to legal understanding and improve operational efficiency. The platform is especially relevant in contexts where early legal guidance, structured complaint handling, and grounded legal retrieval can significantly improve outcomes for users. With continued corpus expansion, model refinement, and deployment hardening, NyayaSetu has the potential to become a valuable legal-support infrastructure for citizens, police workflows, and legal-tech innovation in India.</w:t>
-      </w:r>
-    </w:p>
-    <w:p>
-      <w:pPr>
-        <w:pStyle w:val="Heading1"/>
-      </w:pPr>
-      <w:r>
-        <w:t>Abstract</w:t>
-      </w:r>
-    </w:p>
-    <w:p>
-      <w:r>
-        <w:t>NyayaSetu is an AI-powered legal intelligence platform designed to support Indian legal workflows through open-source and self-hosted technologies. The system combines retrieval-augmented generation, legal document processing, FIR drafting assistance, semantic legal research, contract analysis, evidence analysis, and case strength estimation in a unified platform. It is built to help citizens, police officers, legal researchers, and legal professionals by converting unstructured legal inputs into grounded, structured, and editable outputs. The platform uses official legal sources such as India Code, Gazette publications, BNS, BNSS, BSA, IPC references, and court judgments, which are cleaned, chunked, embedded, and indexed in FAISS for efficient retrieval. FastAPI powers the backend, React provides the frontend interface, SQLite stores lightweight application records, and DuckDB supports corpus analytics. NyayaSetu also includes OCR and speech-to-text pipelines for complaint extraction and voice FIR filing. The project demonstrates how legal AI can be built with privacy-preserving, open-source infrastructure while remaining practical for real-world legal assistance and procedural support.</w:t>
-      </w:r>
-    </w:p>
-    <w:p>
-      <w:pPr>
-        <w:pStyle w:val="Heading1"/>
-      </w:pPr>
-      <w:r>
-        <w:t>Keywords</w:t>
-      </w:r>
-    </w:p>
-    <w:p>
-      <w:pPr>
-        <w:pStyle w:val="ListBullet"/>
-      </w:pPr>
-      <w:r>
-        <w:t>Legal AI</w:t>
-      </w:r>
-    </w:p>
-    <w:p>
-      <w:pPr>
-        <w:pStyle w:val="ListBullet"/>
-      </w:pPr>
-      <w:r>
-        <w:t>NyayaSetu</w:t>
-      </w:r>
-    </w:p>
-    <w:p>
-      <w:pPr>
-        <w:pStyle w:val="ListBullet"/>
-      </w:pPr>
-      <w:r>
-        <w:t>FIR Generator</w:t>
-      </w:r>
-    </w:p>
-    <w:p>
-      <w:pPr>
-        <w:pStyle w:val="ListBullet"/>
-      </w:pPr>
-      <w:r>
-        <w:t>Retrieval-Augmented Generation</w:t>
-      </w:r>
-    </w:p>
-    <w:p>
-      <w:pPr>
-        <w:pStyle w:val="ListBullet"/>
-      </w:pPr>
-      <w:r>
-        <w:t>Indian Law</w:t>
-      </w:r>
-    </w:p>
-    <w:p>
-      <w:pPr>
-        <w:pStyle w:val="ListBullet"/>
-      </w:pPr>
-      <w:r>
-        <w:t>FAISS</w:t>
-      </w:r>
-    </w:p>
-    <w:p>
-      <w:pPr>
-        <w:pStyle w:val="ListBullet"/>
-      </w:pPr>
-      <w:r>
-        <w:t>Legal Research</w:t>
-      </w:r>
-    </w:p>
-    <w:p>
-      <w:pPr>
-        <w:pStyle w:val="ListBullet"/>
-      </w:pPr>
-      <w:r>
-        <w:t>Open-Source AI</w:t>
-      </w:r>
-    </w:p>
-    <w:p>
-      <w:pPr>
-        <w:pStyle w:val="Heading1"/>
-      </w:pPr>
-      <w:r>
-        <w:t>Executive Summary</w:t>
-      </w:r>
-    </w:p>
-    <w:p>
-      <w:r>
-        <w:t>NyayaSetu is a self-hosted legal-tech platform built to support grounded legal assistance in the Indian context. It integrates legal Q and A, FIR generation, case analysis, document drafting, contract review, evidence analysis, and case strength estimation using open-source models and retrieval over official legal documents. The system is designed for both citizens and institutional users, especially where structured early-stage legal guidance is valuable. By combining FastAPI services, a React interface, FAISS-based retrieval, SQLite and DuckDB storage, and model-ready open-source pipelines, NyayaSetu offers a practical foundation for privacy-conscious and scalable legal intelligence tooling.</w:t>
+        <w:t>NyayaSetu represents a practical legal AI platform built for the Indian justice ecosystem. By combining hybrid retrieval, grounded legal explanation, FIR workflow automation, verified professional access, and collaborative legal services, the system moves beyond a simple chatbot and toward a structured digital legal infrastructure. Its design emphasizes accuracy, explainability, usability, and scalability, making it a strong foundation for accessible and intelligent legal technology.</w:t>
       </w:r>
     </w:p>
     <w:sectPr>

</xml_diff>